<commit_message>
Refresh downloadable CV (added competencies)
Co-Authored-By: Claude Opus 5 <noreply@anthropic.com>
</commit_message>
<xml_diff>
--- a/public/assets/britney-cv.docx
+++ b/public/assets/britney-cv.docx
@@ -72,7 +72,7 @@
         </w:pBdr>
         <w:spacing w:after="200"/>
       </w:pPr>
-      <w:hyperlink w:history="1" r:id="rIdk7a5nksjroupykoa-fmfn">
+      <w:hyperlink w:history="1" r:id="rIdjogfqkp_ju_6cc1d2u25k">
         <w:r>
           <w:rPr>
             <w:rFonts w:ascii="Calibri" w:cs="Calibri" w:eastAsia="Calibri" w:hAnsi="Calibri"/>
@@ -93,7 +93,7 @@
         </w:rPr>
         <w:t xml:space="preserve">   |   </w:t>
       </w:r>
-      <w:hyperlink w:history="1" r:id="rId6j7rphgovepdesobminbo">
+      <w:hyperlink w:history="1" r:id="rIdevp3lt0iqpw8tfhbluzc2">
         <w:r>
           <w:rPr>
             <w:rFonts w:ascii="Calibri" w:cs="Calibri" w:eastAsia="Calibri" w:hAnsi="Calibri"/>
@@ -114,7 +114,7 @@
         </w:rPr>
         <w:t xml:space="preserve">   |   </w:t>
       </w:r>
-      <w:hyperlink w:history="1" r:id="rIduix-cws5naqg2j2vgbl26">
+      <w:hyperlink w:history="1" r:id="rId0oantsdq7lfzmm6sv4q_e">
         <w:r>
           <w:rPr>
             <w:rFonts w:ascii="Calibri" w:cs="Calibri" w:eastAsia="Calibri" w:hAnsi="Calibri"/>
@@ -1093,7 +1093,7 @@
         </w:rPr>
         <w:t xml:space="preserve">Live demo: </w:t>
       </w:r>
-      <w:hyperlink w:history="1" r:id="rIdm4mbzjqz3st47yfjbmfn0">
+      <w:hyperlink w:history="1" r:id="rIdyw3wddkxdspzfspyzw7n6">
         <w:r>
           <w:rPr>
             <w:rFonts w:ascii="Calibri" w:cs="Calibri" w:eastAsia="Calibri" w:hAnsi="Calibri"/>
@@ -1295,7 +1295,7 @@
         </w:rPr>
         <w:t xml:space="preserve">Live site: </w:t>
       </w:r>
-      <w:hyperlink w:history="1" r:id="rIdmfdk2xpgmhsf2di0kt5us">
+      <w:hyperlink w:history="1" r:id="rIdmdff1ovg03fcwmfljfobc">
         <w:r>
           <w:rPr>
             <w:rFonts w:ascii="Calibri" w:cs="Calibri" w:eastAsia="Calibri" w:hAnsi="Calibri"/>
@@ -1594,7 +1594,7 @@
           <w:sz w:val="20"/>
           <w:szCs w:val="20"/>
         </w:rPr>
-        <w:t xml:space="preserve">Collaboration  ·  Communication  ·  Problem-Solving  ·  Analytical Thinking  ·  Accountability  ·  Adaptability  ·  Time Management  ·  Client Handover &amp; Training</w:t>
+        <w:t xml:space="preserve">Collaboration  ·  Communication  ·  Problem-Solving  ·  Attention to Detail  ·  Analytical Thinking  ·  Accountability  ·  Adaptability  ·  Self-Management (Independent Contractor)  ·  Time Management  ·  Client Handover &amp; Training</w:t>
       </w:r>
     </w:p>
     <w:p>

</xml_diff>